<commit_message>
docs: Update report and banner with KNP brand colors, Department of Agriculture & Computing and Informatics, and refined market linkage flow
</commit_message>
<xml_diff>
--- a/Kitale_ASK_Show_2026_Project_Report.docx
+++ b/Kitale_ASK_Show_2026_Project_Report.docx
@@ -9,7 +9,7 @@
       <w:r>
         <w:rPr>
           <w:b/>
-          <w:color w:val="1B5E20"/>
+          <w:color w:val="003399"/>
           <w:sz w:val="36"/>
         </w:rPr>
         <w:t>KITALE NATIONAL POLYTECHNIC</w:t>
@@ -21,7 +21,7 @@
           <w:color w:val="424242"/>
           <w:sz w:val="24"/>
         </w:rPr>
-        <w:t>DEPARTMENT OF COMPUTER SCIENCE &amp; INFORMATION TECHNOLOGY</w:t>
+        <w:t>DEPARTMENT OF AGRICULTURE AND COMPUTING AND INFORMATICS</w:t>
         <w:br/>
       </w:r>
     </w:p>
@@ -58,7 +58,7 @@
           <w:color w:val="333333"/>
           <w:sz w:val="23"/>
         </w:rPr>
-        <w:t>An Intelligent, Offline-First Mobile Application for Precision Swine Husbandry, Health Tracking, Least-Cost Feed Formulation, and Financial Analytics in Kenya</w:t>
+        <w:t>An Intelligent, Offline-First Mobile Application for Precision Swine Husbandry, Health Tracking, Least-Cost Feed Formulation, Market Linkage, and Financial Analytics</w:t>
       </w:r>
     </w:p>
     <w:p>
@@ -92,7 +92,7 @@
             <w:r>
               <w:rPr>
                 <w:b/>
-                <w:color w:val="1B5E20"/>
+                <w:color w:val="003399"/>
                 <w:sz w:val="21"/>
               </w:rPr>
               <w:t>EVENT:</w:t>
@@ -134,7 +134,7 @@
             <w:r>
               <w:rPr>
                 <w:b/>
-                <w:color w:val="1B5E20"/>
+                <w:color w:val="003399"/>
                 <w:sz w:val="21"/>
               </w:rPr>
               <w:t>SHOW THEME:</w:t>
@@ -177,133 +177,7 @@
             <w:r>
               <w:rPr>
                 <w:b/>
-                <w:color w:val="1B5E20"/>
-                <w:sz w:val="21"/>
-              </w:rPr>
-              <w:t>INNOVATOR:</w:t>
-            </w:r>
-          </w:p>
-        </w:tc>
-        <w:tc>
-          <w:tcPr>
-            <w:tcW w:type="dxa" w:w="6192"/>
-            <w:tcMar>
-              <w:top w:w="60" w:type="dxa"/>
-              <w:bottom w:w="60" w:type="dxa"/>
-              <w:left w:w="60" w:type="dxa"/>
-              <w:right w:w="60" w:type="dxa"/>
-            </w:tcMar>
-          </w:tcPr>
-          <w:p>
-            <w:r>
-              <w:rPr>
-                <w:sz w:val="21"/>
-              </w:rPr>
-              <w:t>Anditi Andrew Awala</w:t>
-            </w:r>
-          </w:p>
-        </w:tc>
-      </w:tr>
-      <w:tr>
-        <w:tc>
-          <w:tcPr>
-            <w:tcW w:type="dxa" w:w="3168"/>
-            <w:tcMar>
-              <w:top w:w="60" w:type="dxa"/>
-              <w:bottom w:w="60" w:type="dxa"/>
-              <w:left w:w="60" w:type="dxa"/>
-              <w:right w:w="60" w:type="dxa"/>
-            </w:tcMar>
-          </w:tcPr>
-          <w:p>
-            <w:r>
-              <w:rPr>
-                <w:b/>
-                <w:color w:val="1B5E20"/>
-                <w:sz w:val="21"/>
-              </w:rPr>
-              <w:t>REGISTRATION NO:</w:t>
-            </w:r>
-          </w:p>
-        </w:tc>
-        <w:tc>
-          <w:tcPr>
-            <w:tcW w:type="dxa" w:w="6192"/>
-            <w:tcMar>
-              <w:top w:w="60" w:type="dxa"/>
-              <w:bottom w:w="60" w:type="dxa"/>
-              <w:left w:w="60" w:type="dxa"/>
-              <w:right w:w="60" w:type="dxa"/>
-            </w:tcMar>
-          </w:tcPr>
-          <w:p>
-            <w:r>
-              <w:rPr>
-                <w:sz w:val="21"/>
-              </w:rPr>
-              <w:t>IT-DCSL/4451889/24</w:t>
-            </w:r>
-          </w:p>
-        </w:tc>
-      </w:tr>
-      <w:tr>
-        <w:tc>
-          <w:tcPr>
-            <w:tcW w:type="dxa" w:w="3168"/>
-            <w:tcMar>
-              <w:top w:w="60" w:type="dxa"/>
-              <w:bottom w:w="60" w:type="dxa"/>
-              <w:left w:w="60" w:type="dxa"/>
-              <w:right w:w="60" w:type="dxa"/>
-            </w:tcMar>
-          </w:tcPr>
-          <w:p>
-            <w:r>
-              <w:rPr>
-                <w:b/>
-                <w:color w:val="1B5E20"/>
-                <w:sz w:val="21"/>
-              </w:rPr>
-              <w:t>SUPERVISOR:</w:t>
-            </w:r>
-          </w:p>
-        </w:tc>
-        <w:tc>
-          <w:tcPr>
-            <w:tcW w:type="dxa" w:w="6192"/>
-            <w:tcMar>
-              <w:top w:w="60" w:type="dxa"/>
-              <w:bottom w:w="60" w:type="dxa"/>
-              <w:left w:w="60" w:type="dxa"/>
-              <w:right w:w="60" w:type="dxa"/>
-            </w:tcMar>
-          </w:tcPr>
-          <w:p>
-            <w:r>
-              <w:rPr>
-                <w:sz w:val="21"/>
-              </w:rPr>
-              <w:t>Mr. Harrison Wekesa</w:t>
-            </w:r>
-          </w:p>
-        </w:tc>
-      </w:tr>
-      <w:tr>
-        <w:tc>
-          <w:tcPr>
-            <w:tcW w:type="dxa" w:w="3168"/>
-            <w:tcMar>
-              <w:top w:w="60" w:type="dxa"/>
-              <w:bottom w:w="60" w:type="dxa"/>
-              <w:left w:w="60" w:type="dxa"/>
-              <w:right w:w="60" w:type="dxa"/>
-            </w:tcMar>
-          </w:tcPr>
-          <w:p>
-            <w:r>
-              <w:rPr>
-                <w:b/>
-                <w:color w:val="1B5E20"/>
+                <w:color w:val="003399"/>
                 <w:sz w:val="21"/>
               </w:rPr>
               <w:t>SUBMISSION DATE:</w:t>
@@ -344,7 +218,7 @@
       <w:r>
         <w:rPr>
           <w:b/>
-          <w:color w:val="1B5E20"/>
+          <w:color w:val="003399"/>
           <w:sz w:val="32"/>
         </w:rPr>
         <w:t>EXECUTIVE SUMMARY</w:t>
@@ -355,13 +229,10 @@
         <w:spacing w:line="276" w:lineRule="auto" w:after="200"/>
       </w:pPr>
       <w:r>
-        <w:t>The smallholder pig farming sector in Kenya, particularly in Trans-Nzoia County and the wider Western/Rift Valley regions, plays a vital role in food security, employment generation, and economic empowerment. However, pig farmers face severe operational bottlenecks, including unorganized paper-based record-keeping, high feed prices (accounting for 70–80% of total production costs), untracked disease outbreaks, poor breeding management, and lack of real-time financial transparency.</w:t>
+        <w:t>The smallholder pig farming sector in Kenya plays a vital role in food security, employment generation, and economic empowerment. However, pig farmers face severe operational bottlenecks, including unorganized paper-based record-keeping, high feed prices (accounting for 70–80% of total production costs), untracked disease outbreaks, poor breeding management, and lack of real-time financial transparency.</w:t>
         <w:br/>
         <w:br/>
-        <w:t>The Digital Pig Farm Manager is a cutting-edge, offline-first mobile Android application designed specifically to address these challenges. Developed natively in Kotlin using modern Jetpack Compose UI, Room SQLite database, and automated analytics engine, the system empowers farmers to manage individual pig lifecycles, log health and vaccination events for single pigs or entire categories (weaners, growers, finishers, boars, sows), formulate least-cost feed rations with exact decimal precision, and generate dynamic reports covering Feed Conversion Ratio (FCR), Average Daily Gain (ADG), disease incidence rates, farrowing efficiency, and Profit &amp; Loss (P&amp;L) performance.</w:t>
-        <w:br/>
-        <w:br/>
-        <w:t>Furthermore, the application integrates Kenya’s official administrative structure across all 47 Counties, Sub-Counties, and Wards, allowing localized disease tracking and farm registration. Designed with an offline-first architecture, the app ensures smallholder farmers in remote areas with poor internet connectivity can seamlessly maintain accurate records without data loss.</w:t>
+        <w:t>The Digital Pig Farm Manager is an offline-first mobile Android application developed in Kotlin using modern Jetpack Compose UI, Room SQLite database, and automated analytics engine. The system empowers farmers to manage individual pig lifecycles, log health and vaccination events for single pigs or entire categories (weaners, growers, finishers, boars, sows), record buyer transactions at point of sale for direct market linkage, formulate least-cost feed rations, and generate dynamic reports covering Feed Conversion Ratio (FCR), Average Daily Gain (ADG), disease incidence rates, farrowing efficiency, and Profit &amp; Loss (P&amp;L) performance.</w:t>
         <w:br/>
         <w:br/>
         <w:t>This project directly aligns with the Kitale ASK Show 2026 theme by introducing digital climate-smart technology to optimize resource utilization, reduce feed wastage, prevent livestock mortality, and promote commercial agribusiness sustainability.</w:t>
@@ -375,7 +246,7 @@
       <w:r>
         <w:rPr>
           <w:b/>
-          <w:color w:val="1B5E20"/>
+          <w:color w:val="003399"/>
           <w:sz w:val="32"/>
         </w:rPr>
         <w:t>TABLE OF CONTENTS</w:t>
@@ -388,7 +259,7 @@
       <w:r>
         <w:rPr>
           <w:b/>
-          <w:color w:val="1B5E20"/>
+          <w:color w:val="003399"/>
           <w:sz w:val="21"/>
         </w:rPr>
         <w:t>1. Cover Page &amp; Executive Summary</w:t>
@@ -401,7 +272,7 @@
       <w:r>
         <w:rPr>
           <w:b/>
-          <w:color w:val="1B5E20"/>
+          <w:color w:val="003399"/>
           <w:sz w:val="21"/>
         </w:rPr>
         <w:t>2. Chapter 1: Introduction &amp; Research Background</w:t>
@@ -414,7 +285,7 @@
       <w:r>
         <w:rPr>
           <w:b/>
-          <w:color w:val="1B5E20"/>
+          <w:color w:val="003399"/>
           <w:sz w:val="21"/>
         </w:rPr>
         <w:t xml:space="preserve">   1.1 Background of the Study</w:t>
@@ -427,7 +298,7 @@
       <w:r>
         <w:rPr>
           <w:b/>
-          <w:color w:val="1B5E20"/>
+          <w:color w:val="003399"/>
           <w:sz w:val="21"/>
         </w:rPr>
         <w:t xml:space="preserve">   1.2 Problem Statement</w:t>
@@ -440,7 +311,7 @@
       <w:r>
         <w:rPr>
           <w:b/>
-          <w:color w:val="1B5E20"/>
+          <w:color w:val="003399"/>
           <w:sz w:val="21"/>
         </w:rPr>
         <w:t xml:space="preserve">   1.3 Research Questions</w:t>
@@ -453,7 +324,7 @@
       <w:r>
         <w:rPr>
           <w:b/>
-          <w:color w:val="1B5E20"/>
+          <w:color w:val="003399"/>
           <w:sz w:val="21"/>
         </w:rPr>
         <w:t xml:space="preserve">   1.4 Objectives of the Project (Main &amp; Specific Objectives)</w:t>
@@ -466,7 +337,7 @@
       <w:r>
         <w:rPr>
           <w:b/>
-          <w:color w:val="1B5E20"/>
+          <w:color w:val="003399"/>
           <w:sz w:val="21"/>
         </w:rPr>
         <w:t xml:space="preserve">   1.5 Justification and Significance of the System</w:t>
@@ -479,7 +350,7 @@
       <w:r>
         <w:rPr>
           <w:b/>
-          <w:color w:val="1B5E20"/>
+          <w:color w:val="003399"/>
           <w:sz w:val="21"/>
         </w:rPr>
         <w:t xml:space="preserve">   1.6 Scope and Delimitations</w:t>
@@ -492,7 +363,7 @@
       <w:r>
         <w:rPr>
           <w:b/>
-          <w:color w:val="1B5E20"/>
+          <w:color w:val="003399"/>
           <w:sz w:val="21"/>
         </w:rPr>
         <w:t>3. Chapter 2: System Features &amp; Visual Breakdown</w:t>
@@ -505,7 +376,7 @@
       <w:r>
         <w:rPr>
           <w:b/>
-          <w:color w:val="1B5E20"/>
+          <w:color w:val="003399"/>
           <w:sz w:val="21"/>
         </w:rPr>
         <w:t xml:space="preserve">   2.1 Core System Capabilities</w:t>
@@ -518,10 +389,10 @@
       <w:r>
         <w:rPr>
           <w:b/>
-          <w:color w:val="1B5E20"/>
+          <w:color w:val="003399"/>
           <w:sz w:val="21"/>
         </w:rPr>
-        <w:t xml:space="preserve">   2.2 System Workflows &amp; Architectural Diagrams</w:t>
+        <w:t xml:space="preserve">   2.2 Market Connection &amp; Sales Flow Workflow</w:t>
       </w:r>
     </w:p>
     <w:p>
@@ -531,7 +402,7 @@
       <w:r>
         <w:rPr>
           <w:b/>
-          <w:color w:val="1B5E20"/>
+          <w:color w:val="003399"/>
           <w:sz w:val="21"/>
         </w:rPr>
         <w:t>4. Chapter 3: System Design &amp; Methodology</w:t>
@@ -544,7 +415,7 @@
       <w:r>
         <w:rPr>
           <w:b/>
-          <w:color w:val="1B5E20"/>
+          <w:color w:val="003399"/>
           <w:sz w:val="21"/>
         </w:rPr>
         <w:t xml:space="preserve">   3.1 Development Methodology (Agile Scrum)</w:t>
@@ -557,7 +428,7 @@
       <w:r>
         <w:rPr>
           <w:b/>
-          <w:color w:val="1B5E20"/>
+          <w:color w:val="003399"/>
           <w:sz w:val="21"/>
         </w:rPr>
         <w:t xml:space="preserve">   3.2 System Architecture (MVVM &amp; Clean Architecture)</w:t>
@@ -570,7 +441,7 @@
       <w:r>
         <w:rPr>
           <w:b/>
-          <w:color w:val="1B5E20"/>
+          <w:color w:val="003399"/>
           <w:sz w:val="21"/>
         </w:rPr>
         <w:t xml:space="preserve">   3.3 Database Schema &amp; Entity Design</w:t>
@@ -583,7 +454,7 @@
       <w:r>
         <w:rPr>
           <w:b/>
-          <w:color w:val="1B5E20"/>
+          <w:color w:val="003399"/>
           <w:sz w:val="21"/>
         </w:rPr>
         <w:t xml:space="preserve">   3.4 Key Mathematical &amp; Analytical Algorithms (FCR, ADG, P&amp;L)</w:t>
@@ -596,7 +467,7 @@
       <w:r>
         <w:rPr>
           <w:b/>
-          <w:color w:val="1B5E20"/>
+          <w:color w:val="003399"/>
           <w:sz w:val="21"/>
         </w:rPr>
         <w:t>5. Project Budget &amp; Resource Allocation (Total Ksh 5,000.00)</w:t>
@@ -609,7 +480,7 @@
       <w:r>
         <w:rPr>
           <w:b/>
-          <w:color w:val="1B5E20"/>
+          <w:color w:val="003399"/>
           <w:sz w:val="21"/>
         </w:rPr>
         <w:t>6. Chapter 4: Conclusion &amp; Recommendations</w:t>
@@ -622,7 +493,7 @@
       <w:r>
         <w:rPr>
           <w:b/>
-          <w:color w:val="1B5E20"/>
+          <w:color w:val="003399"/>
           <w:sz w:val="21"/>
         </w:rPr>
         <w:t>7. References (APA Style)</w:t>
@@ -641,7 +512,7 @@
       <w:r>
         <w:rPr>
           <w:b/>
-          <w:color w:val="1B5E20"/>
+          <w:color w:val="003399"/>
           <w:sz w:val="32"/>
         </w:rPr>
         <w:t>CHAPTER 1: INTRODUCTION &amp; RESEARCH BACKGROUND</w:t>
@@ -669,7 +540,7 @@
         <w:t>Sub-Saharan Africa has witnessed rapid growth in pig production over the past decade, driven by urban population growth, changing dietary habits, and increasing demand for pork products. In Kenya, pig farming offers high feed-to-meat conversion efficiency, short gestation periods (114 days), and prolific litter sizes, making it an attractive enterprise for smallholder farmers and youth entrepreneurs.</w:t>
         <w:br/>
         <w:br/>
-        <w:t>Despite this potential, swine farming in Kenya remains predominantly informal. Most smallholders rely on memory or physical notebooks to track mating dates, farrowing schedules, feed consumption, mortality rates, and medical treatments. This lack of structured data leads to severe management deficiencies including unintentional inbreeding, inaccurate feeding, untracked disease outbreaks (e.g. African Swine Fever), and lack of financial accounting clarity.</w:t>
+        <w:t>Despite this potential, swine farming in Kenya remains predominantly informal. Most smallholders rely on memory or physical notebooks to track mating dates, farrowing schedules, feed consumption, mortality rates, and medical treatments. This lack of structured data leads to severe management deficiencies.</w:t>
       </w:r>
     </w:p>
     <w:p>
@@ -691,7 +562,7 @@
         <w:spacing w:line="276" w:lineRule="auto" w:after="160"/>
       </w:pPr>
       <w:r>
-        <w:t>Traditional pig farming in Kenya is crippled by manual, error-prone record-keeping systems and a lack of real-time analytical tools. Farmers are unable to: (1) accurately monitor individual pig health histories and category-wide disease trends; (2) calculate crucial biological performance metrics such as Feed Conversion Ratio (FCR) and Average Daily Gain (ADG); (3) access custom regional location mapping (Counties, Sub-Counties, Wards); (4) obtain consolidated Profit &amp; Loss reports; and (5) operate software in remote rural areas without internet connections. There is an urgent need for an offline-capable, intuitive mobile application tailored to Kenya's agricultural ecosystem.</w:t>
+        <w:t>Traditional pig farming is crippled by manual record-keeping systems and a lack of real-time analytical tools. Farmers are unable to: (1) accurately monitor individual pig health histories and category-wide disease trends; (2) compute biological performance metrics like FCR and ADG; (3) link pig sales directly with buyer contact records (butcheries, processors, traders); and (4) generate consolidated Profit &amp; Loss reports.</w:t>
       </w:r>
     </w:p>
     <w:p>
@@ -723,7 +594,7 @@
         <w:spacing w:after="80"/>
       </w:pPr>
       <w:r>
-        <w:t>What database architecture allows seamless offline operation with full administrative spatial mapping for Kenya?</w:t>
+        <w:t>How can sales workflows allow farmers to directly add and track buyer contacts during transactions?</w:t>
       </w:r>
     </w:p>
     <w:p>
@@ -765,7 +636,7 @@
     </w:p>
     <w:p>
       <w:r>
-        <w:t>To design, develop, and deploy an offline-first mobile Android application—Digital Pig Farm Manager—that automates swine herd tracking, veterinary health logging, least-cost feed formulation, and comprehensive financial/production reporting for smallholder pig farmers in Kenya.</w:t>
+        <w:t>To design, develop, and deploy an offline-first mobile Android application—Digital Pig Farm Manager—that automates swine herd tracking, veterinary health logging, market buyer sales logging, least-cost feed formulation, and financial/production reporting.</w:t>
       </w:r>
     </w:p>
     <w:p>
@@ -788,7 +659,7 @@
         <w:spacing w:after="80"/>
       </w:pPr>
       <w:r>
-        <w:t>To implement an individual and group pig tracking module supporting biological stages (piglets, weaners, growers, finishers, boars, sows, gilts), lineage, and weight history.</w:t>
+        <w:t>To implement an individual and group pig tracking module supporting biological stages (piglets, weaners, growers, finishers, boars, sows), lineage, and weight history.</w:t>
       </w:r>
     </w:p>
     <w:p>
@@ -806,7 +677,7 @@
         <w:spacing w:after="80"/>
       </w:pPr>
       <w:r>
-        <w:t>To develop a regional administrative location picker incorporating all 47 Kenya Counties, Sub-Counties, and Wards.</w:t>
+        <w:t>To design a sales and market linkage module enabling farmers to capture buyer details (name, contact, buyer category like butchery, processor, trader) at the point of sale.</w:t>
       </w:r>
     </w:p>
     <w:p>
@@ -843,7 +714,7 @@
     </w:p>
     <w:p>
       <w:r>
-        <w:t>The system significantly boosts smallholder profitability by reducing feed wastage, preventing livestock mortality, and offering verifiable digital financial records necessary for agricultural micro-loan applications. It directly supports Kenya's Agricultural Sector Transformation and Growth Strategy (ASTGS) and the Kitale ASK Show 2026 climate-smart theme.</w:t>
+        <w:t>The system boosts smallholder profitability by reducing feed wastage, preventing livestock mortality, organizing buyer histories, and offering verifiable digital financial records for agribusiness sustainability.</w:t>
       </w:r>
     </w:p>
     <w:p>
@@ -862,7 +733,7 @@
     </w:p>
     <w:p>
       <w:r>
-        <w:t>Scope covers Android mobile development (Kotlin/Jetpack Compose, Room SQLite) with 100% offline capability. Direct IoT ear-tag sensor hardware integration is outside the initial v1.0.0 scope.</w:t>
+        <w:t>Scope covers Android mobile development (Kotlin/Jetpack Compose, Room SQLite) with 100% offline capability.</w:t>
       </w:r>
     </w:p>
     <w:p>
@@ -873,7 +744,7 @@
       <w:r>
         <w:rPr>
           <w:b/>
-          <w:color w:val="1B5E20"/>
+          <w:color w:val="003399"/>
           <w:sz w:val="32"/>
         </w:rPr>
         <w:t>CHAPTER 2: SYSTEM FEATURES &amp; VISUAL BREAKDOWN</w:t>
@@ -917,7 +788,7 @@
         <w:spacing w:after="80"/>
       </w:pPr>
       <w:r>
-        <w:t>Kenya Administrative Mapping: Complete 47 Kenya Counties, Sub-Counties, and Wards dropdown picker.</w:t>
+        <w:t>Market Connection &amp; Sales Flow: Farmers record buyer contact details and buyer type (butchery, processor, trader) directly when logging pig sales.</w:t>
       </w:r>
     </w:p>
     <w:p>
@@ -946,7 +817,7 @@
       <w:r>
         <w:rPr>
           <w:b/>
-          <w:color w:val="1B5E20"/>
+          <w:color w:val="003399"/>
           <w:sz w:val="32"/>
         </w:rPr>
         <w:t>CHAPTER 3: SYSTEM DESIGN &amp; METHODOLOGY</w:t>
@@ -968,7 +839,7 @@
     </w:p>
     <w:p>
       <w:r>
-        <w:t>The project adopted Agile Scrum methodology across 5 iterative sprints: Database schema design, UI &amp; Herd registry, Health logging &amp; Formulator, Reports Hub &amp; Location mapping, and Device testing &amp; GitHub deployment.</w:t>
+        <w:t>The project adopted Agile Scrum methodology across 5 iterative sprints: Database schema design, UI &amp; Herd registry, Health logging &amp; Formulator, Reports Hub &amp; Sales flow, and Device testing &amp; GitHub deployment.</w:t>
       </w:r>
     </w:p>
     <w:p>
@@ -987,7 +858,7 @@
     </w:p>
     <w:p>
       <w:r>
-        <w:t>Built using official Android Model-View-ViewModel (MVVM) clean architecture: Jetpack Compose for UI, MainViewModel with Kotlin StateFlow for reactive state, PHMSRepository, and Room SQLite Database (v6) for local persistence.</w:t>
+        <w:t>Built using official Android Model-View-ViewModel (MVVM) clean architecture: Jetpack Compose for UI, MainViewModel with Kotlin StateFlow for reactive state, PHMSRepository, and Room SQLite Database for local persistence.</w:t>
       </w:r>
     </w:p>
     <w:p>
@@ -1001,12 +872,12 @@
           <w:color w:val="0D47A1"/>
           <w:sz w:val="26"/>
         </w:rPr>
-        <w:t>3.3 Database Schema (Room SQLite v6)</w:t>
+        <w:t>3.3 Database Schema</w:t>
       </w:r>
     </w:p>
     <w:p>
       <w:r>
-        <w:t>The SQLite database comprises 7 core entities: PigEntity, HealthEventEntity, FeedStockEntity, FeedFormulationEntity, BreedingRecordEntity, SalesEntity, and ExpenseEntity.</w:t>
+        <w:t>The SQLite database comprises core entities: PigEntity, HealthEventEntity, FeedStockEntity, FeedFormulationEntity, BreedingRecordEntity, SalesEntity (including buyer details), and ExpenseEntity.</w:t>
       </w:r>
     </w:p>
     <w:p>
@@ -1047,7 +918,7 @@
       <w:r>
         <w:rPr>
           <w:b/>
-          <w:color w:val="1B5E20"/>
+          <w:color w:val="003399"/>
           <w:sz w:val="32"/>
         </w:rPr>
         <w:t>PROJECT BUDGET &amp; RESOURCE ALLOCATION</w:t>
@@ -1076,7 +947,7 @@
         <w:tc>
           <w:tcPr>
             <w:tcW w:type="dxa" w:w="1872"/>
-            <w:shd w:fill="1B5E20"/>
+            <w:shd w:fill="003399"/>
             <w:tcMar>
               <w:top w:w="80" w:type="dxa"/>
               <w:bottom w:w="80" w:type="dxa"/>
@@ -1101,7 +972,7 @@
         <w:tc>
           <w:tcPr>
             <w:tcW w:type="dxa" w:w="1872"/>
-            <w:shd w:fill="1B5E20"/>
+            <w:shd w:fill="003399"/>
             <w:tcMar>
               <w:top w:w="80" w:type="dxa"/>
               <w:bottom w:w="80" w:type="dxa"/>
@@ -1126,7 +997,7 @@
         <w:tc>
           <w:tcPr>
             <w:tcW w:type="dxa" w:w="1872"/>
-            <w:shd w:fill="1B5E20"/>
+            <w:shd w:fill="003399"/>
             <w:tcMar>
               <w:top w:w="80" w:type="dxa"/>
               <w:bottom w:w="80" w:type="dxa"/>
@@ -1151,7 +1022,7 @@
         <w:tc>
           <w:tcPr>
             <w:tcW w:type="dxa" w:w="1872"/>
-            <w:shd w:fill="1B5E20"/>
+            <w:shd w:fill="003399"/>
             <w:tcMar>
               <w:top w:w="80" w:type="dxa"/>
               <w:bottom w:w="80" w:type="dxa"/>
@@ -1176,7 +1047,7 @@
         <w:tc>
           <w:tcPr>
             <w:tcW w:type="dxa" w:w="1872"/>
-            <w:shd w:fill="1B5E20"/>
+            <w:shd w:fill="003399"/>
             <w:tcMar>
               <w:top w:w="80" w:type="dxa"/>
               <w:bottom w:w="80" w:type="dxa"/>
@@ -1348,7 +1219,7 @@
               <w:rPr>
                 <w:sz w:val="19"/>
               </w:rPr>
-              <w:t>Field Data Collection &amp; Farmer Logistics (Trans-Nzoia)</w:t>
+              <w:t>Field Data Collection &amp; Farmer Logistics</w:t>
             </w:r>
           </w:p>
         </w:tc>
@@ -1758,7 +1629,7 @@
         <w:tc>
           <w:tcPr>
             <w:tcW w:type="dxa" w:w="1008"/>
-            <w:shd w:fill="E8F5E9"/>
+            <w:shd w:fill="E8EAF6"/>
             <w:tcMar>
               <w:top w:w="60" w:type="dxa"/>
               <w:bottom w:w="60" w:type="dxa"/>
@@ -1773,7 +1644,7 @@
             <w:r>
               <w:rPr>
                 <w:b/>
-                <w:color w:val="1B5E20"/>
+                <w:color w:val="003399"/>
                 <w:sz w:val="19"/>
               </w:rPr>
               <w:t>TOTAL</w:t>
@@ -1783,7 +1654,7 @@
         <w:tc>
           <w:tcPr>
             <w:tcW w:type="dxa" w:w="3888"/>
-            <w:shd w:fill="E8F5E9"/>
+            <w:shd w:fill="E8EAF6"/>
             <w:tcMar>
               <w:top w:w="60" w:type="dxa"/>
               <w:bottom w:w="60" w:type="dxa"/>
@@ -1795,7 +1666,7 @@
             <w:r>
               <w:rPr>
                 <w:b/>
-                <w:color w:val="1B5E20"/>
+                <w:color w:val="003399"/>
                 <w:sz w:val="19"/>
               </w:rPr>
               <w:t>GRAND TOTAL PROJECT BUDGET</w:t>
@@ -1805,7 +1676,7 @@
         <w:tc>
           <w:tcPr>
             <w:tcW w:type="dxa" w:w="1584"/>
-            <w:shd w:fill="E8F5E9"/>
+            <w:shd w:fill="E8EAF6"/>
             <w:tcMar>
               <w:top w:w="60" w:type="dxa"/>
               <w:bottom w:w="60" w:type="dxa"/>
@@ -1820,7 +1691,7 @@
             <w:r>
               <w:rPr>
                 <w:b/>
-                <w:color w:val="1B5E20"/>
+                <w:color w:val="003399"/>
                 <w:sz w:val="19"/>
               </w:rPr>
             </w:r>
@@ -1829,7 +1700,7 @@
         <w:tc>
           <w:tcPr>
             <w:tcW w:type="dxa" w:w="1440"/>
-            <w:shd w:fill="E8F5E9"/>
+            <w:shd w:fill="E8EAF6"/>
             <w:tcMar>
               <w:top w:w="60" w:type="dxa"/>
               <w:bottom w:w="60" w:type="dxa"/>
@@ -1844,7 +1715,7 @@
             <w:r>
               <w:rPr>
                 <w:b/>
-                <w:color w:val="1B5E20"/>
+                <w:color w:val="003399"/>
                 <w:sz w:val="19"/>
               </w:rPr>
             </w:r>
@@ -1853,7 +1724,7 @@
         <w:tc>
           <w:tcPr>
             <w:tcW w:type="dxa" w:w="1584"/>
-            <w:shd w:fill="E8F5E9"/>
+            <w:shd w:fill="E8EAF6"/>
             <w:tcMar>
               <w:top w:w="60" w:type="dxa"/>
               <w:bottom w:w="60" w:type="dxa"/>
@@ -1868,7 +1739,7 @@
             <w:r>
               <w:rPr>
                 <w:b/>
-                <w:color w:val="1B5E20"/>
+                <w:color w:val="003399"/>
                 <w:sz w:val="19"/>
               </w:rPr>
               <w:t>Ksh 5,000.00</w:t>
@@ -1885,7 +1756,7 @@
       <w:r>
         <w:rPr>
           <w:b/>
-          <w:color w:val="1B5E20"/>
+          <w:color w:val="003399"/>
           <w:sz w:val="32"/>
         </w:rPr>
         <w:t>CHAPTER 4: CONCLUSION &amp; RECOMMENDATIONS</w:t>
@@ -1907,7 +1778,7 @@
     </w:p>
     <w:p>
       <w:r>
-        <w:t>The Digital Pig Farm Manager successfully bridges the digital gap in smallholder pig farming. By providing offline-first records, least-cost feed formulation, Kenya administrative mapping, and automated P&amp;L analytics, the system advances climate-smart, tech-driven commercial agriculture.</w:t>
+        <w:t>The Digital Pig Farm Manager successfully bridges the digital gap in smallholder pig farming. By providing offline-first records, least-cost feed formulation, direct sales buyer tracking, and automated P&amp;L analytics, the system advances climate-smart, tech-driven commercial agriculture.</w:t>
       </w:r>
     </w:p>
     <w:p>
@@ -1937,7 +1808,7 @@
       <w:r>
         <w:rPr>
           <w:b/>
-          <w:color w:val="1B5E20"/>
+          <w:color w:val="003399"/>
           <w:sz w:val="32"/>
         </w:rPr>
         <w:t>REFERENCES</w:t>

</xml_diff>